<commit_message>
Revision 10: print settings dialog, column selection, adaptive rounding, bar charts; archive old requirements
Co-Authored-By: Claude Sonnet 4.6 <noreply@anthropic.com>
</commit_message>
<xml_diff>
--- a/watts-up-unified-requirements with Revision 8 edits.docx
+++ b/watts-up-unified-requirements with Revision 8 edits.docx
@@ -59,23 +59,7 @@
         <w:divId w:val="2125691486"/>
       </w:pPr>
       <w:r>
-        <w:t xml:space="preserve">Documents load changes associated with </w:t>
-      </w:r>
-      <w:proofErr w:type="gramStart"/>
-      <w:r>
-        <w:t>an aircraft</w:t>
-      </w:r>
-      <w:proofErr w:type="gramEnd"/>
-      <w:r>
-        <w:t xml:space="preserve"> modification and </w:t>
-      </w:r>
-      <w:proofErr w:type="gramStart"/>
-      <w:r>
-        <w:t>calculates</w:t>
-      </w:r>
-      <w:proofErr w:type="gramEnd"/>
-      <w:r>
-        <w:t xml:space="preserve"> net changes, new loads, and remaining capacity for each affected item.</w:t>
+        <w:t>Documents load changes associated with an aircraft modification and calculates net changes, new loads, and remaining capacity for each affected item.</w:t>
       </w:r>
     </w:p>
     <w:p>
@@ -373,17 +357,8 @@
                 <w:b/>
                 <w:bCs/>
               </w:rPr>
-              <w:t xml:space="preserve">Default </w:t>
+              <w:t>Default convPf</w:t>
             </w:r>
-            <w:proofErr w:type="spellStart"/>
-            <w:r>
-              <w:rPr>
-                <w:b/>
-                <w:bCs/>
-              </w:rPr>
-              <w:t>convPf</w:t>
-            </w:r>
-            <w:proofErr w:type="spellEnd"/>
           </w:p>
         </w:tc>
       </w:tr>
@@ -896,15 +871,7 @@
         <w:divId w:val="1105883042"/>
       </w:pPr>
       <w:r>
-        <w:t xml:space="preserve">VA = V × A = W / pf = </w:t>
-      </w:r>
-      <w:proofErr w:type="gramStart"/>
-      <w:r>
-        <w:t>√(</w:t>
-      </w:r>
-      <w:proofErr w:type="gramEnd"/>
-      <w:r>
-        <w:t>W² + VAR²)</w:t>
+        <w:t>VA = V × A = W / pf = √(W² + VAR²)</w:t>
       </w:r>
     </w:p>
     <w:p>
@@ -917,15 +884,7 @@
         <w:divId w:val="1105883042"/>
       </w:pPr>
       <w:r>
-        <w:t xml:space="preserve">W = VA × pf = </w:t>
-      </w:r>
-      <w:proofErr w:type="gramStart"/>
-      <w:r>
-        <w:t>√(</w:t>
-      </w:r>
-      <w:proofErr w:type="gramEnd"/>
-      <w:r>
-        <w:t>VA² − VAR²)</w:t>
+        <w:t>W = VA × pf = √(VA² − VAR²)</w:t>
       </w:r>
     </w:p>
     <w:p>
@@ -951,31 +910,7 @@
         <w:divId w:val="1105883042"/>
       </w:pPr>
       <w:r>
-        <w:t xml:space="preserve">VAR = </w:t>
-      </w:r>
-      <w:proofErr w:type="gramStart"/>
-      <w:r>
-        <w:t>√(</w:t>
-      </w:r>
-      <w:proofErr w:type="gramEnd"/>
-      <w:r>
-        <w:t xml:space="preserve">VA² − W²) = </w:t>
-      </w:r>
-      <w:proofErr w:type="gramStart"/>
-      <w:r>
-        <w:t>√(</w:t>
-      </w:r>
-      <w:proofErr w:type="gramEnd"/>
-      <w:r>
-        <w:t xml:space="preserve">VA² − (VA × </w:t>
-      </w:r>
-      <w:proofErr w:type="gramStart"/>
-      <w:r>
-        <w:t>pf)²</w:t>
-      </w:r>
-      <w:proofErr w:type="gramEnd"/>
-      <w:r>
-        <w:t>)</w:t>
+        <w:t>VAR = √(VA² − W²) = √(VA² − (VA × pf)²)</w:t>
       </w:r>
     </w:p>
     <w:p>
@@ -1036,15 +971,7 @@
         <w:divId w:val="1105883042"/>
       </w:pPr>
       <w:r>
-        <w:t xml:space="preserve">Recalculate VA = </w:t>
-      </w:r>
-      <w:proofErr w:type="gramStart"/>
-      <w:r>
-        <w:t>√(</w:t>
-      </w:r>
-      <w:proofErr w:type="gramEnd"/>
-      <w:r>
-        <w:t>W² + VAR²).</w:t>
+        <w:t>Recalculate VA = √(W² + VAR²).</w:t>
       </w:r>
     </w:p>
     <w:p>
@@ -1168,15 +1095,7 @@
         <w:divId w:val="1105883042"/>
       </w:pPr>
       <w:r>
-        <w:t xml:space="preserve">"Root" label </w:t>
-      </w:r>
-      <w:proofErr w:type="gramStart"/>
-      <w:r>
-        <w:t>suppressed</w:t>
-      </w:r>
-      <w:proofErr w:type="gramEnd"/>
-      <w:r>
-        <w:t xml:space="preserve"> from display.</w:t>
+        <w:t>"Root" label suppressed from display.</w:t>
       </w:r>
     </w:p>
     <w:p>
@@ -1189,37 +1108,13 @@
         <w:divId w:val="1105883042"/>
       </w:pPr>
       <w:r>
-        <w:t>Node label format: Description [</w:t>
-      </w:r>
-      <w:proofErr w:type="spellStart"/>
-      <w:r>
-        <w:t>RefDes</w:t>
-      </w:r>
-      <w:proofErr w:type="spellEnd"/>
-      <w:r>
-        <w:t xml:space="preserve">] </w:t>
+        <w:t xml:space="preserve">Node label format: Description [RefDes] </w:t>
       </w:r>
       <w:r>
         <w:t>–</w:t>
       </w:r>
       <w:r>
-        <w:t xml:space="preserve"> </w:t>
-      </w:r>
-      <w:proofErr w:type="spellStart"/>
-      <w:r>
-        <w:t>RefDes</w:t>
-      </w:r>
-      <w:proofErr w:type="spellEnd"/>
-      <w:r>
-        <w:t xml:space="preserve"> in square brackets appended to the description, rendered in subdued secondary text; </w:t>
-      </w:r>
-      <w:proofErr w:type="spellStart"/>
-      <w:r>
-        <w:t>RefDes</w:t>
-      </w:r>
-      <w:proofErr w:type="spellEnd"/>
-      <w:r>
-        <w:t xml:space="preserve"> omitted if blank.</w:t>
+        <w:t xml:space="preserve"> RefDes in square brackets appended to the description, rendered in subdued secondary text; RefDes omitted if blank.</w:t>
       </w:r>
     </w:p>
     <w:p>
@@ -1377,23 +1272,7 @@
         <w:divId w:val="1105883042"/>
       </w:pPr>
       <w:r>
-        <w:t>Description column uses the same Description [</w:t>
-      </w:r>
-      <w:proofErr w:type="spellStart"/>
-      <w:r>
-        <w:t>RefDes</w:t>
-      </w:r>
-      <w:proofErr w:type="spellEnd"/>
-      <w:r>
-        <w:t xml:space="preserve">] format; there is no separate </w:t>
-      </w:r>
-      <w:proofErr w:type="spellStart"/>
-      <w:r>
-        <w:t>RefDes</w:t>
-      </w:r>
-      <w:proofErr w:type="spellEnd"/>
-      <w:r>
-        <w:t xml:space="preserve"> column.</w:t>
+        <w:t>Description column uses the same Description [RefDes] format; there is no separate RefDes column.</w:t>
       </w:r>
     </w:p>
     <w:p>
@@ -2485,13 +2364,8 @@
         </w:numPr>
         <w:divId w:val="1105883042"/>
       </w:pPr>
-      <w:proofErr w:type="spellStart"/>
-      <w:r>
-        <w:t>RefDes</w:t>
-      </w:r>
-      <w:proofErr w:type="spellEnd"/>
-      <w:r>
-        <w:t xml:space="preserve"> (optional)</w:t>
+      <w:r>
+        <w:t>RefDes (optional)</w:t>
       </w:r>
     </w:p>
     <w:p>
@@ -4452,7 +4326,6 @@
         </w:numPr>
         <w:divId w:val="1105883042"/>
       </w:pPr>
-      <w:proofErr w:type="spellStart"/>
       <w:r>
         <w:rPr>
           <w:b/>
@@ -4460,7 +4333,6 @@
         </w:rPr>
         <w:t>convPf</w:t>
       </w:r>
-      <w:proofErr w:type="spellEnd"/>
       <w:r>
         <w:t xml:space="preserve"> input — visible for TRU</w:t>
       </w:r>
@@ -4699,13 +4571,7 @@
       </w:ins>
       <w:ins w:id="113" w:author="B. Gillett" w:date="2026-06-02T22:09:00Z" w16du:dateUtc="2026-06-03T03:09:00Z">
         <w:r>
-          <w:t>Input</w:t>
-        </w:r>
-        <w:r>
-          <w:t xml:space="preserve"> Exist. Load </w:t>
-        </w:r>
-        <w:r>
-          <w:t xml:space="preserve">(A); Input </w:t>
+          <w:t xml:space="preserve">Input Exist. Load (A); Input </w:t>
         </w:r>
       </w:ins>
       <w:ins w:id="114" w:author="B. Gillett" w:date="2026-06-02T22:10:00Z" w16du:dateUtc="2026-06-03T03:10:00Z">
@@ -4813,10 +4679,7 @@
       </w:ins>
       <w:ins w:id="132" w:author="B. Gillett" w:date="2026-06-03T21:12:00Z" w16du:dateUtc="2026-06-04T02:12:00Z">
         <w:r>
-          <w:t>§</w:t>
-        </w:r>
-        <w:r>
-          <w:t>7.12)</w:t>
+          <w:t>§7.12)</w:t>
         </w:r>
       </w:ins>
     </w:p>
@@ -4861,15 +4724,7 @@
         <w:divId w:val="1105883042"/>
       </w:pPr>
       <w:r>
-        <w:t xml:space="preserve">For Conv IN nodes, also copies the </w:t>
-      </w:r>
-      <w:proofErr w:type="gramStart"/>
-      <w:r>
-        <w:t>paired OUT</w:t>
-      </w:r>
-      <w:proofErr w:type="gramEnd"/>
-      <w:r>
-        <w:t xml:space="preserve"> child node as a child of the copy.</w:t>
+        <w:t>For Conv IN nodes, also copies the paired OUT child node as a child of the copy.</w:t>
       </w:r>
     </w:p>
     <w:p>
@@ -4913,34 +4768,20 @@
           <w:rPr>
             <w:rFonts w:asciiTheme="minorHAnsi" w:hAnsiTheme="minorHAnsi" w:cstheme="minorBidi"/>
           </w:rPr>
-          <w:t>7.1</w:t>
-        </w:r>
-        <w:r>
-          <w:rPr>
-            <w:rFonts w:asciiTheme="minorHAnsi" w:hAnsiTheme="minorHAnsi" w:cstheme="minorBidi"/>
-          </w:rPr>
-          <w:t>2</w:t>
-        </w:r>
-        <w:r>
-          <w:rPr>
-            <w:rFonts w:asciiTheme="minorHAnsi" w:hAnsiTheme="minorHAnsi" w:cstheme="minorBidi"/>
-          </w:rPr>
-          <w:t xml:space="preserve"> </w:t>
-        </w:r>
-        <w:r>
-          <w:rPr>
-            <w:rFonts w:asciiTheme="minorHAnsi" w:hAnsiTheme="minorHAnsi" w:cstheme="minorBidi"/>
-          </w:rPr>
-          <w:t>Calculate button</w:t>
+          <w:t>7.12 Calculate button</w:t>
         </w:r>
       </w:ins>
     </w:p>
     <w:p>
       <w:pPr>
         <w:pStyle w:val="PlainText"/>
+        <w:numPr>
+          <w:ilvl w:val="0"/>
+          <w:numId w:val="17"/>
+        </w:numPr>
         <w:divId w:val="1105883042"/>
         <w:rPr>
-          <w:ins w:id="135" w:author="B. Gillett" w:date="2026-06-03T21:09:00Z" w16du:dateUtc="2026-06-04T02:09:00Z"/>
+          <w:ins w:id="135" w:author="B. Gillett" w:date="2026-06-04T06:07:00Z" w16du:dateUtc="2026-06-04T11:07:00Z"/>
         </w:rPr>
       </w:pPr>
       <w:ins w:id="136" w:author="B. Gillett" w:date="2026-06-03T21:10:00Z" w16du:dateUtc="2026-06-04T02:10:00Z">
@@ -4953,6 +4794,29 @@
           <w:t>missing values in blank fields</w:t>
         </w:r>
       </w:ins>
+      <w:ins w:id="138" w:author="B. Gillett" w:date="2026-06-04T06:07:00Z" w16du:dateUtc="2026-06-04T11:07:00Z">
+        <w:r>
+          <w:t>.</w:t>
+        </w:r>
+      </w:ins>
+    </w:p>
+    <w:p>
+      <w:pPr>
+        <w:pStyle w:val="PlainText"/>
+        <w:numPr>
+          <w:ilvl w:val="0"/>
+          <w:numId w:val="17"/>
+        </w:numPr>
+        <w:divId w:val="1105883042"/>
+        <w:rPr>
+          <w:ins w:id="139" w:author="B. Gillett" w:date="2026-06-03T21:09:00Z" w16du:dateUtc="2026-06-04T02:09:00Z"/>
+        </w:rPr>
+      </w:pPr>
+      <w:ins w:id="140" w:author="B. Gillett" w:date="2026-06-04T06:07:00Z" w16du:dateUtc="2026-06-04T11:07:00Z">
+        <w:r>
+          <w:t>Applies to AC and DC items</w:t>
+        </w:r>
+      </w:ins>
     </w:p>
     <w:p>
       <w:pPr>
@@ -5087,6 +4951,7 @@
           <w:b/>
           <w:bCs/>
         </w:rPr>
+        <w:lastRenderedPageBreak/>
         <w:t>AC / DC</w:t>
       </w:r>
       <w:r>
@@ -5103,7 +4968,6 @@
         <w:divId w:val="1105883042"/>
       </w:pPr>
       <w:r>
-        <w:lastRenderedPageBreak/>
         <w:t>Master-detail table (§8.3)</w:t>
       </w:r>
     </w:p>
@@ -5116,20 +4980,20 @@
         </w:numPr>
         <w:divId w:val="1105883042"/>
         <w:rPr>
-          <w:ins w:id="138" w:author="B. Gillett" w:date="2026-06-03T20:57:00Z" w16du:dateUtc="2026-06-04T01:57:00Z"/>
+          <w:ins w:id="141" w:author="B. Gillett" w:date="2026-06-03T20:57:00Z" w16du:dateUtc="2026-06-04T01:57:00Z"/>
         </w:rPr>
       </w:pPr>
-      <w:ins w:id="139" w:author="B. Gillett" w:date="2026-06-03T20:55:00Z" w16du:dateUtc="2026-06-04T01:55:00Z">
+      <w:ins w:id="142" w:author="B. Gillett" w:date="2026-06-03T20:55:00Z" w16du:dateUtc="2026-06-04T01:55:00Z">
         <w:r>
           <w:t>Duplicate row</w:t>
         </w:r>
       </w:ins>
-      <w:ins w:id="140" w:author="B. Gillett" w:date="2026-06-03T20:56:00Z" w16du:dateUtc="2026-06-04T01:56:00Z">
+      <w:ins w:id="143" w:author="B. Gillett" w:date="2026-06-03T20:56:00Z" w16du:dateUtc="2026-06-04T01:56:00Z">
         <w:r>
           <w:t xml:space="preserve"> </w:t>
         </w:r>
       </w:ins>
-      <w:ins w:id="141" w:author="B. Gillett" w:date="2026-06-03T20:57:00Z" w16du:dateUtc="2026-06-04T01:57:00Z">
+      <w:ins w:id="144" w:author="B. Gillett" w:date="2026-06-03T20:57:00Z" w16du:dateUtc="2026-06-04T01:57:00Z">
         <w:r>
           <w:t>button</w:t>
         </w:r>
@@ -5144,15 +5008,15 @@
         </w:numPr>
         <w:divId w:val="1105883042"/>
         <w:rPr>
-          <w:ins w:id="142" w:author="B. Gillett" w:date="2026-06-03T20:58:00Z" w16du:dateUtc="2026-06-04T01:58:00Z"/>
+          <w:ins w:id="145" w:author="B. Gillett" w:date="2026-06-03T20:58:00Z" w16du:dateUtc="2026-06-04T01:58:00Z"/>
         </w:rPr>
       </w:pPr>
-      <w:ins w:id="143" w:author="B. Gillett" w:date="2026-06-03T20:57:00Z" w16du:dateUtc="2026-06-04T01:57:00Z">
+      <w:ins w:id="146" w:author="B. Gillett" w:date="2026-06-03T20:57:00Z" w16du:dateUtc="2026-06-04T01:57:00Z">
         <w:r>
           <w:t>Copies the act</w:t>
         </w:r>
       </w:ins>
-      <w:ins w:id="144" w:author="B. Gillett" w:date="2026-06-03T20:58:00Z" w16du:dateUtc="2026-06-04T01:58:00Z">
+      <w:ins w:id="147" w:author="B. Gillett" w:date="2026-06-03T20:58:00Z" w16du:dateUtc="2026-06-04T01:58:00Z">
         <w:r>
           <w:t>ive row in the detail table and appends “(copy)” to the description</w:t>
         </w:r>
@@ -5184,11 +5048,11 @@
         </w:numPr>
         <w:divId w:val="1105883042"/>
         <w:rPr>
-          <w:del w:id="145" w:author="B. Gillett" w:date="2026-06-03T20:52:00Z" w16du:dateUtc="2026-06-04T01:52:00Z"/>
+          <w:del w:id="148" w:author="B. Gillett" w:date="2026-06-03T20:52:00Z" w16du:dateUtc="2026-06-04T01:52:00Z"/>
           <w:rFonts w:cs="Times New Roman"/>
         </w:rPr>
       </w:pPr>
-      <w:del w:id="146" w:author="B. Gillett" w:date="2026-06-03T20:52:00Z" w16du:dateUtc="2026-06-04T01:52:00Z">
+      <w:del w:id="149" w:author="B. Gillett" w:date="2026-06-03T20:52:00Z" w16du:dateUtc="2026-06-04T01:52:00Z">
         <w:r>
           <w:delText>On open, clear existing table rows.</w:delText>
         </w:r>
@@ -5204,15 +5068,7 @@
         <w:divId w:val="1105883042"/>
       </w:pPr>
       <w:r>
-        <w:t xml:space="preserve">Remember the last-used Item Type and </w:t>
-      </w:r>
-      <w:proofErr w:type="gramStart"/>
-      <w:r>
-        <w:t>Status, and</w:t>
-      </w:r>
-      <w:proofErr w:type="gramEnd"/>
-      <w:r>
-        <w:t xml:space="preserve"> restore them on next open.</w:t>
+        <w:t>Remember the last-used Item Type and Status, and restore them on next open.</w:t>
       </w:r>
     </w:p>
     <w:p>
@@ -5224,21 +5080,21 @@
         </w:numPr>
         <w:divId w:val="1105883042"/>
         <w:rPr>
-          <w:ins w:id="147" w:author="B. Gillett" w:date="2026-06-03T20:52:00Z" w16du:dateUtc="2026-06-04T01:52:00Z"/>
+          <w:ins w:id="150" w:author="B. Gillett" w:date="2026-06-03T20:52:00Z" w16du:dateUtc="2026-06-04T01:52:00Z"/>
           <w:rFonts w:cs="Times New Roman"/>
         </w:rPr>
       </w:pPr>
-      <w:ins w:id="148" w:author="B. Gillett" w:date="2026-06-03T20:52:00Z" w16du:dateUtc="2026-06-04T01:52:00Z">
+      <w:ins w:id="151" w:author="B. Gillett" w:date="2026-06-03T20:52:00Z" w16du:dateUtc="2026-06-04T01:52:00Z">
         <w:r>
           <w:t xml:space="preserve">On open, </w:t>
         </w:r>
       </w:ins>
-      <w:ins w:id="149" w:author="B. Gillett" w:date="2026-06-03T20:53:00Z" w16du:dateUtc="2026-06-04T01:53:00Z">
+      <w:ins w:id="152" w:author="B. Gillett" w:date="2026-06-03T20:53:00Z" w16du:dateUtc="2026-06-04T01:53:00Z">
         <w:r>
           <w:t>display one table row with content cleared</w:t>
         </w:r>
       </w:ins>
-      <w:ins w:id="150" w:author="B. Gillett" w:date="2026-06-03T20:52:00Z" w16du:dateUtc="2026-06-04T01:52:00Z">
+      <w:ins w:id="153" w:author="B. Gillett" w:date="2026-06-03T20:52:00Z" w16du:dateUtc="2026-06-04T01:52:00Z">
         <w:r>
           <w:t>.</w:t>
         </w:r>
@@ -5264,27 +5120,11 @@
         <w:pStyle w:val="PlainText"/>
         <w:divId w:val="1105883042"/>
         <w:rPr>
-          <w:ins w:id="151" w:author="B. Gillett" w:date="2026-06-03T21:18:00Z" w16du:dateUtc="2026-06-04T02:18:00Z"/>
+          <w:ins w:id="154" w:author="B. Gillett" w:date="2026-06-03T21:18:00Z" w16du:dateUtc="2026-06-04T02:18:00Z"/>
         </w:rPr>
       </w:pPr>
       <w:r>
-        <w:t xml:space="preserve">All row types </w:t>
-      </w:r>
-      <w:proofErr w:type="gramStart"/>
-      <w:r>
-        <w:t>include:</w:t>
-      </w:r>
-      <w:proofErr w:type="gramEnd"/>
-      <w:r>
-        <w:t xml:space="preserve"> Description, </w:t>
-      </w:r>
-      <w:proofErr w:type="spellStart"/>
-      <w:r>
-        <w:t>RefDes</w:t>
-      </w:r>
-      <w:proofErr w:type="spellEnd"/>
-      <w:r>
-        <w:t xml:space="preserve"> (optional).</w:t>
+        <w:t>All row types include: Description, RefDes (optional).</w:t>
       </w:r>
     </w:p>
     <w:p>
@@ -5292,20 +5132,20 @@
         <w:pStyle w:val="PlainText"/>
         <w:divId w:val="1105883042"/>
         <w:rPr>
-          <w:ins w:id="152" w:author="B. Gillett" w:date="2026-06-03T21:18:00Z" w16du:dateUtc="2026-06-04T02:18:00Z"/>
+          <w:ins w:id="155" w:author="B. Gillett" w:date="2026-06-03T21:18:00Z" w16du:dateUtc="2026-06-04T02:18:00Z"/>
         </w:rPr>
       </w:pPr>
-      <w:ins w:id="153" w:author="B. Gillett" w:date="2026-06-03T21:18:00Z" w16du:dateUtc="2026-06-04T02:18:00Z">
+      <w:ins w:id="156" w:author="B. Gillett" w:date="2026-06-03T21:18:00Z" w16du:dateUtc="2026-06-04T02:18:00Z">
         <w:r>
           <w:t xml:space="preserve">Order columns as listed </w:t>
         </w:r>
       </w:ins>
-      <w:ins w:id="154" w:author="B. Gillett" w:date="2026-06-03T21:20:00Z" w16du:dateUtc="2026-06-04T02:20:00Z">
+      <w:ins w:id="157" w:author="B. Gillett" w:date="2026-06-03T21:20:00Z" w16du:dateUtc="2026-06-04T02:20:00Z">
         <w:r>
           <w:t>below</w:t>
         </w:r>
       </w:ins>
-      <w:ins w:id="155" w:author="B. Gillett" w:date="2026-06-03T21:18:00Z" w16du:dateUtc="2026-06-04T02:18:00Z">
+      <w:ins w:id="158" w:author="B. Gillett" w:date="2026-06-03T21:18:00Z" w16du:dateUtc="2026-06-04T02:18:00Z">
         <w:r>
           <w:t>.</w:t>
         </w:r>
@@ -5316,15 +5156,15 @@
         <w:pStyle w:val="PlainText"/>
         <w:divId w:val="1105883042"/>
         <w:rPr>
-          <w:ins w:id="156" w:author="B. Gillett" w:date="2026-06-03T21:24:00Z" w16du:dateUtc="2026-06-04T02:24:00Z"/>
+          <w:ins w:id="159" w:author="B. Gillett" w:date="2026-06-03T21:24:00Z" w16du:dateUtc="2026-06-04T02:24:00Z"/>
         </w:rPr>
       </w:pPr>
-      <w:ins w:id="157" w:author="B. Gillett" w:date="2026-06-03T21:18:00Z" w16du:dateUtc="2026-06-04T02:18:00Z">
+      <w:ins w:id="160" w:author="B. Gillett" w:date="2026-06-03T21:18:00Z" w16du:dateUtc="2026-06-04T02:18:00Z">
         <w:r>
           <w:t xml:space="preserve">Show </w:t>
         </w:r>
       </w:ins>
-      <w:ins w:id="158" w:author="B. Gillett" w:date="2026-06-03T21:21:00Z" w16du:dateUtc="2026-06-04T02:21:00Z">
+      <w:ins w:id="161" w:author="B. Gillett" w:date="2026-06-03T21:21:00Z" w16du:dateUtc="2026-06-04T02:21:00Z">
         <w:r>
           <w:t xml:space="preserve">all columns </w:t>
         </w:r>
@@ -5338,47 +5178,47 @@
           <w:rFonts w:cs="Times New Roman"/>
         </w:rPr>
       </w:pPr>
-      <w:ins w:id="159" w:author="B. Gillett" w:date="2026-06-03T21:24:00Z" w16du:dateUtc="2026-06-04T02:24:00Z">
+      <w:ins w:id="162" w:author="B. Gillett" w:date="2026-06-03T21:24:00Z" w16du:dateUtc="2026-06-04T02:24:00Z">
         <w:r>
           <w:t xml:space="preserve">Expand </w:t>
         </w:r>
       </w:ins>
-      <w:ins w:id="160" w:author="B. Gillett" w:date="2026-06-03T21:41:00Z" w16du:dateUtc="2026-06-04T02:41:00Z">
+      <w:ins w:id="163" w:author="B. Gillett" w:date="2026-06-03T21:41:00Z" w16du:dateUtc="2026-06-04T02:41:00Z">
         <w:r>
           <w:t xml:space="preserve">the </w:t>
         </w:r>
       </w:ins>
-      <w:ins w:id="161" w:author="B. Gillett" w:date="2026-06-03T21:24:00Z" w16du:dateUtc="2026-06-04T02:24:00Z">
+      <w:ins w:id="164" w:author="B. Gillett" w:date="2026-06-03T21:24:00Z" w16du:dateUtc="2026-06-04T02:24:00Z">
         <w:r>
           <w:t xml:space="preserve">dialog box </w:t>
         </w:r>
       </w:ins>
-      <w:ins w:id="162" w:author="B. Gillett" w:date="2026-06-03T21:41:00Z" w16du:dateUtc="2026-06-04T02:41:00Z">
+      <w:ins w:id="165" w:author="B. Gillett" w:date="2026-06-03T21:41:00Z" w16du:dateUtc="2026-06-04T02:41:00Z">
         <w:r>
           <w:t xml:space="preserve">width </w:t>
         </w:r>
       </w:ins>
-      <w:ins w:id="163" w:author="B. Gillett" w:date="2026-06-03T21:28:00Z" w16du:dateUtc="2026-06-04T02:28:00Z">
+      <w:ins w:id="166" w:author="B. Gillett" w:date="2026-06-03T21:28:00Z" w16du:dateUtc="2026-06-04T02:28:00Z">
         <w:r>
           <w:t xml:space="preserve">when </w:t>
         </w:r>
       </w:ins>
-      <w:ins w:id="164" w:author="B. Gillett" w:date="2026-06-03T21:41:00Z" w16du:dateUtc="2026-06-04T02:41:00Z">
+      <w:ins w:id="167" w:author="B. Gillett" w:date="2026-06-03T21:41:00Z" w16du:dateUtc="2026-06-04T02:41:00Z">
         <w:r>
           <w:t xml:space="preserve">necessary </w:t>
         </w:r>
       </w:ins>
-      <w:ins w:id="165" w:author="B. Gillett" w:date="2026-06-03T21:24:00Z" w16du:dateUtc="2026-06-04T02:24:00Z">
+      <w:ins w:id="168" w:author="B. Gillett" w:date="2026-06-03T21:24:00Z" w16du:dateUtc="2026-06-04T02:24:00Z">
         <w:r>
           <w:t xml:space="preserve">to show </w:t>
         </w:r>
       </w:ins>
-      <w:ins w:id="166" w:author="B. Gillett" w:date="2026-06-03T21:26:00Z" w16du:dateUtc="2026-06-04T02:26:00Z">
+      <w:ins w:id="169" w:author="B. Gillett" w:date="2026-06-03T21:26:00Z" w16du:dateUtc="2026-06-04T02:26:00Z">
         <w:r>
           <w:t xml:space="preserve">all rows </w:t>
         </w:r>
       </w:ins>
-      <w:ins w:id="167" w:author="B. Gillett" w:date="2026-06-03T21:27:00Z" w16du:dateUtc="2026-06-04T02:27:00Z">
+      <w:ins w:id="170" w:author="B. Gillett" w:date="2026-06-03T21:27:00Z" w16du:dateUtc="2026-06-04T02:27:00Z">
         <w:r>
           <w:t xml:space="preserve">in table </w:t>
         </w:r>
@@ -5684,15 +5524,7 @@
         </w:rPr>
       </w:pPr>
       <w:r>
-        <w:t xml:space="preserve">Any number of independent root nodes </w:t>
-      </w:r>
-      <w:proofErr w:type="gramStart"/>
-      <w:r>
-        <w:t>allowed</w:t>
-      </w:r>
-      <w:proofErr w:type="gramEnd"/>
-      <w:r>
-        <w:t>.</w:t>
+        <w:t>Any number of independent root nodes allowed.</w:t>
       </w:r>
     </w:p>
     <w:p>
@@ -5871,52 +5703,9 @@
             <w:pPr>
               <w:pStyle w:val="PlainText"/>
             </w:pPr>
-            <w:proofErr w:type="spellStart"/>
             <w:r>
               <w:t>loadValue</w:t>
             </w:r>
-            <w:proofErr w:type="spellEnd"/>
-          </w:p>
-        </w:tc>
-      </w:tr>
-      <w:tr>
-        <w:trPr>
-          <w:divId w:val="1105883042"/>
-          <w:tblCellSpacing w:w="15" w:type="dxa"/>
-        </w:trPr>
-        <w:tc>
-          <w:tcPr>
-            <w:tcW w:w="0" w:type="auto"/>
-            <w:vAlign w:val="center"/>
-            <w:hideMark/>
-          </w:tcPr>
-          <w:p>
-            <w:pPr>
-              <w:pStyle w:val="PlainText"/>
-            </w:pPr>
-            <w:r>
-              <w:t>Load, status = Removed</w:t>
-            </w:r>
-          </w:p>
-        </w:tc>
-        <w:tc>
-          <w:tcPr>
-            <w:tcW w:w="0" w:type="auto"/>
-            <w:vAlign w:val="center"/>
-            <w:hideMark/>
-          </w:tcPr>
-          <w:p>
-            <w:pPr>
-              <w:pStyle w:val="PlainText"/>
-            </w:pPr>
-            <w:r>
-              <w:t>−</w:t>
-            </w:r>
-            <w:proofErr w:type="spellStart"/>
-            <w:r>
-              <w:t>loadValue</w:t>
-            </w:r>
-            <w:proofErr w:type="spellEnd"/>
           </w:p>
         </w:tc>
       </w:tr>
@@ -5937,6 +5726,42 @@
             </w:pPr>
             <w:r>
               <w:lastRenderedPageBreak/>
+              <w:t>Load, status = Removed</w:t>
+            </w:r>
+          </w:p>
+        </w:tc>
+        <w:tc>
+          <w:tcPr>
+            <w:tcW w:w="0" w:type="auto"/>
+            <w:vAlign w:val="center"/>
+            <w:hideMark/>
+          </w:tcPr>
+          <w:p>
+            <w:pPr>
+              <w:pStyle w:val="PlainText"/>
+            </w:pPr>
+            <w:r>
+              <w:t>−loadValue</w:t>
+            </w:r>
+          </w:p>
+        </w:tc>
+      </w:tr>
+      <w:tr>
+        <w:trPr>
+          <w:divId w:val="1105883042"/>
+          <w:tblCellSpacing w:w="15" w:type="dxa"/>
+        </w:trPr>
+        <w:tc>
+          <w:tcPr>
+            <w:tcW w:w="0" w:type="auto"/>
+            <w:vAlign w:val="center"/>
+            <w:hideMark/>
+          </w:tcPr>
+          <w:p>
+            <w:pPr>
+              <w:pStyle w:val="PlainText"/>
+            </w:pPr>
+            <w:r>
               <w:t>Load, status = Existing</w:t>
             </w:r>
           </w:p>
@@ -5988,13 +5813,8 @@
               <w:pStyle w:val="PlainText"/>
             </w:pPr>
             <w:r>
-              <w:t>−</w:t>
+              <w:t>−existingLoad</w:t>
             </w:r>
-            <w:proofErr w:type="spellStart"/>
-            <w:r>
-              <w:t>existingLoad</w:t>
-            </w:r>
-            <w:proofErr w:type="spellEnd"/>
           </w:p>
         </w:tc>
       </w:tr>
@@ -6014,13 +5834,8 @@
               <w:pStyle w:val="PlainText"/>
             </w:pPr>
             <w:r>
-              <w:t xml:space="preserve">Non-load with </w:t>
+              <w:t>Non-load with netChangeOverride</w:t>
             </w:r>
-            <w:proofErr w:type="spellStart"/>
-            <w:r>
-              <w:t>netChangeOverride</w:t>
-            </w:r>
-            <w:proofErr w:type="spellEnd"/>
           </w:p>
         </w:tc>
         <w:tc>
@@ -6106,13 +5921,8 @@
               <w:pStyle w:val="PlainText"/>
             </w:pPr>
             <w:r>
-              <w:t xml:space="preserve">derived from conv OUT NC via efficiency and </w:t>
+              <w:t>derived from conv OUT NC via efficiency and convPf</w:t>
             </w:r>
-            <w:proofErr w:type="spellStart"/>
-            <w:r>
-              <w:t>convPf</w:t>
-            </w:r>
-            <w:proofErr w:type="spellEnd"/>
           </w:p>
         </w:tc>
       </w:tr>
@@ -6152,21 +5962,8 @@
         <w:t>New Load</w:t>
       </w:r>
       <w:r>
-        <w:t xml:space="preserve"> = </w:t>
-      </w:r>
-      <w:proofErr w:type="spellStart"/>
-      <w:r>
-        <w:t>existingLoad</w:t>
-      </w:r>
-      <w:proofErr w:type="spellEnd"/>
-      <w:r>
-        <w:t xml:space="preserve"> + </w:t>
-      </w:r>
-      <w:proofErr w:type="spellStart"/>
-      <w:r>
-        <w:t>netChange</w:t>
-      </w:r>
-      <w:proofErr w:type="spellEnd"/>
+        <w:t xml:space="preserve"> = existingLoad + netChange</w:t>
+      </w:r>
     </w:p>
     <w:p>
       <w:pPr>
@@ -6185,13 +5982,8 @@
         <w:t>Remaining Capacity</w:t>
       </w:r>
       <w:r>
-        <w:t xml:space="preserve"> = capacity − </w:t>
-      </w:r>
-      <w:proofErr w:type="spellStart"/>
-      <w:r>
-        <w:t>newLoad</w:t>
-      </w:r>
-      <w:proofErr w:type="spellEnd"/>
+        <w:t xml:space="preserve"> = capacity − newLoad</w:t>
+      </w:r>
     </w:p>
     <w:p>
       <w:pPr>
@@ -6294,13 +6086,8 @@
             <w:pPr>
               <w:pStyle w:val="PlainText"/>
             </w:pPr>
-            <w:proofErr w:type="gramStart"/>
             <w:r>
-              <w:t>Warn</w:t>
-            </w:r>
-            <w:proofErr w:type="gramEnd"/>
-            <w:r>
-              <w:t xml:space="preserve"> on entry</w:t>
+              <w:t>Warn on entry</w:t>
             </w:r>
           </w:p>
         </w:tc>
@@ -6515,31 +6302,8 @@
         <w:t>Export JSON:</w:t>
       </w:r>
       <w:r>
-        <w:t xml:space="preserve"> metadata + full node tree → file named </w:t>
-      </w:r>
-      <w:proofErr w:type="spellStart"/>
-      <w:proofErr w:type="gramStart"/>
-      <w:r>
-        <w:t>WattsUp</w:t>
-      </w:r>
-      <w:proofErr w:type="spellEnd"/>
-      <w:r>
-        <w:t>_{make}_{model}_{serial}_{</w:t>
-      </w:r>
-      <w:proofErr w:type="gramEnd"/>
-      <w:r>
-        <w:t>date</w:t>
-      </w:r>
-      <w:proofErr w:type="gramStart"/>
-      <w:r>
-        <w:t>}.</w:t>
-      </w:r>
-      <w:proofErr w:type="spellStart"/>
-      <w:r>
-        <w:t>json</w:t>
-      </w:r>
-      <w:proofErr w:type="spellEnd"/>
-      <w:proofErr w:type="gramEnd"/>
+        <w:t xml:space="preserve"> metadata + full node tree → file named WattsUp_{make}_{model}_{serial}_{date}.json</w:t>
+      </w:r>
     </w:p>
     <w:p>
       <w:pPr>
@@ -6575,23 +6339,7 @@
           <w:b/>
           <w:bCs/>
         </w:rPr>
-        <w:t xml:space="preserve">Auto-save to </w:t>
-      </w:r>
-      <w:proofErr w:type="spellStart"/>
-      <w:r>
-        <w:rPr>
-          <w:b/>
-          <w:bCs/>
-        </w:rPr>
-        <w:t>localStorage</w:t>
-      </w:r>
-      <w:proofErr w:type="spellEnd"/>
-      <w:r>
-        <w:rPr>
-          <w:b/>
-          <w:bCs/>
-        </w:rPr>
-        <w:t>:</w:t>
+        <w:t>Auto-save to localStorage:</w:t>
       </w:r>
       <w:r>
         <w:t xml:space="preserve"> state persisted across page refreshes.</w:t>
@@ -6721,29 +6469,17 @@
       <w:pPr>
         <w:pStyle w:val="PlainText"/>
       </w:pPr>
-      <w:proofErr w:type="spellStart"/>
-      <w:r>
-        <w:t>convPf</w:t>
-      </w:r>
-      <w:proofErr w:type="spellEnd"/>
-      <w:r>
-        <w:t xml:space="preserve"> applies to **all** AC conv-item calculations (capacity, existing load, load, net change,</w:t>
-      </w:r>
-    </w:p>
-    <w:p>
-      <w:pPr>
-        <w:pStyle w:val="PlainText"/>
-      </w:pPr>
-      <w:r>
-        <w:t xml:space="preserve">new load). </w:t>
-      </w:r>
-      <w:proofErr w:type="spellStart"/>
-      <w:r>
-        <w:t>convPf</w:t>
-      </w:r>
-      <w:proofErr w:type="spellEnd"/>
-      <w:r>
-        <w:t xml:space="preserve"> field is visible in the dialog for TRU and Frequency Converter.</w:t>
+      <w:r>
+        <w:t>convPf applies to **all** AC conv-item calculations (capacity, existing load, load, net change,</w:t>
+      </w:r>
+    </w:p>
+    <w:p>
+      <w:pPr>
+        <w:pStyle w:val="PlainText"/>
+      </w:pPr>
+      <w:r>
+        <w:lastRenderedPageBreak/>
+        <w:t>new load). convPf field is visible in the dialog for TRU and Frequency Converter.</w:t>
       </w:r>
     </w:p>
     <w:p>
@@ -6760,7 +6496,6 @@
         </w:numPr>
       </w:pPr>
       <w:r>
-        <w:lastRenderedPageBreak/>
         <w:t>Distribution / Protection</w:t>
       </w:r>
     </w:p>
@@ -6869,31 +6604,15 @@
         <w:pStyle w:val="PlainText"/>
       </w:pPr>
       <w:r>
-        <w:t xml:space="preserve">**Capacity and Remaining </w:t>
-      </w:r>
-      <w:proofErr w:type="gramStart"/>
-      <w:r>
-        <w:t>Capacity:*</w:t>
-      </w:r>
-      <w:proofErr w:type="gramEnd"/>
-      <w:r>
-        <w:t>* Amps (A), Volt-Amps (VA)</w:t>
-      </w:r>
-    </w:p>
-    <w:p>
-      <w:pPr>
-        <w:pStyle w:val="PlainText"/>
-      </w:pPr>
-      <w:r>
-        <w:t>**All load columns (Existing Load, Load, Net Change, New Load</w:t>
-      </w:r>
-      <w:proofErr w:type="gramStart"/>
-      <w:r>
-        <w:t>):*</w:t>
-      </w:r>
-      <w:proofErr w:type="gramEnd"/>
-      <w:r>
-        <w:t>* A, VA, W, VAR, pf</w:t>
+        <w:t>**Capacity and Remaining Capacity:** Amps (A), Volt-Amps (VA)</w:t>
+      </w:r>
+    </w:p>
+    <w:p>
+      <w:pPr>
+        <w:pStyle w:val="PlainText"/>
+      </w:pPr>
+      <w:r>
+        <w:t>**All load columns (Existing Load, Load, Net Change, New Load):** A, VA, W, VAR, pf</w:t>
       </w:r>
     </w:p>
     <w:p>
@@ -6914,39 +6633,15 @@
         <w:pStyle w:val="PlainText"/>
       </w:pPr>
       <w:r>
-        <w:t xml:space="preserve">- VA = V × A = W / pf = </w:t>
-      </w:r>
-      <w:proofErr w:type="gramStart"/>
-      <w:r>
-        <w:t>√(</w:t>
-      </w:r>
-      <w:proofErr w:type="gramEnd"/>
-      <w:r>
-        <w:t>W² + VAR²)</w:t>
-      </w:r>
-    </w:p>
-    <w:p>
-      <w:pPr>
-        <w:pStyle w:val="PlainText"/>
-      </w:pPr>
-      <w:r>
-        <w:t xml:space="preserve">- </w:t>
-      </w:r>
-      <w:proofErr w:type="gramStart"/>
-      <w:r>
-        <w:t>W  =</w:t>
-      </w:r>
-      <w:proofErr w:type="gramEnd"/>
-      <w:r>
-        <w:t xml:space="preserve"> VA × pf = </w:t>
-      </w:r>
-      <w:proofErr w:type="gramStart"/>
-      <w:r>
-        <w:t>√(</w:t>
-      </w:r>
-      <w:proofErr w:type="gramEnd"/>
-      <w:r>
-        <w:t>VA² − VAR²)</w:t>
+        <w:t>- VA = V × A = W / pf = √(W² + VAR²)</w:t>
+      </w:r>
+    </w:p>
+    <w:p>
+      <w:pPr>
+        <w:pStyle w:val="PlainText"/>
+      </w:pPr>
+      <w:r>
+        <w:t>- W  = VA × pf = √(VA² − VAR²)</w:t>
       </w:r>
     </w:p>
     <w:p>
@@ -6962,31 +6657,7 @@
         <w:pStyle w:val="PlainText"/>
       </w:pPr>
       <w:r>
-        <w:t xml:space="preserve">- VAR = </w:t>
-      </w:r>
-      <w:proofErr w:type="gramStart"/>
-      <w:r>
-        <w:t>√(</w:t>
-      </w:r>
-      <w:proofErr w:type="gramEnd"/>
-      <w:r>
-        <w:t xml:space="preserve">VA² − W²) = </w:t>
-      </w:r>
-      <w:proofErr w:type="gramStart"/>
-      <w:r>
-        <w:t>√(</w:t>
-      </w:r>
-      <w:proofErr w:type="gramEnd"/>
-      <w:r>
-        <w:t xml:space="preserve">VA² − (VA × </w:t>
-      </w:r>
-      <w:proofErr w:type="gramStart"/>
-      <w:r>
-        <w:t>pf)²</w:t>
-      </w:r>
-      <w:proofErr w:type="gramEnd"/>
-      <w:r>
-        <w:t>)</w:t>
+        <w:t>- VAR = √(VA² − W²) = √(VA² − (VA × pf)²)</w:t>
       </w:r>
     </w:p>
     <w:p>
@@ -7007,33 +6678,20 @@
         <w:pStyle w:val="PlainText"/>
       </w:pPr>
       <w:r>
-        <w:t>*(Applied only at save time; fields are left blank during entry</w:t>
-      </w:r>
-      <w:proofErr w:type="gramStart"/>
-      <w:r>
-        <w:t>.)*</w:t>
-      </w:r>
-      <w:proofErr w:type="gramEnd"/>
-    </w:p>
-    <w:p>
-      <w:pPr>
-        <w:pStyle w:val="PlainText"/>
-      </w:pPr>
-    </w:p>
-    <w:p>
-      <w:pPr>
-        <w:pStyle w:val="PlainText"/>
-      </w:pPr>
-      <w:r>
-        <w:t xml:space="preserve">**AC vector-sum </w:t>
-      </w:r>
-      <w:proofErr w:type="gramStart"/>
-      <w:r>
-        <w:t>aggregation:*</w:t>
-      </w:r>
-      <w:proofErr w:type="gramEnd"/>
-      <w:r>
-        <w:t>*</w:t>
+        <w:t>*(Applied only at save time; fields are left blank during entry.)*</w:t>
+      </w:r>
+    </w:p>
+    <w:p>
+      <w:pPr>
+        <w:pStyle w:val="PlainText"/>
+      </w:pPr>
+    </w:p>
+    <w:p>
+      <w:pPr>
+        <w:pStyle w:val="PlainText"/>
+      </w:pPr>
+      <w:r>
+        <w:t>**AC vector-sum aggregation:**</w:t>
       </w:r>
     </w:p>
     <w:p>
@@ -7049,15 +6707,7 @@
         <w:pStyle w:val="PlainText"/>
       </w:pPr>
       <w:r>
-        <w:t xml:space="preserve">2. Recalculate VA = </w:t>
-      </w:r>
-      <w:proofErr w:type="gramStart"/>
-      <w:r>
-        <w:t>√(</w:t>
-      </w:r>
-      <w:proofErr w:type="gramEnd"/>
-      <w:r>
-        <w:t>W² + VAR²)</w:t>
+        <w:t>2. Recalculate VA = √(W² + VAR²)</w:t>
       </w:r>
     </w:p>
     <w:p>
@@ -7094,15 +6744,7 @@
         <w:pStyle w:val="PlainText"/>
       </w:pPr>
       <w:r>
-        <w:t>**All columns (Capacity, Existing Load, Load, Net Change, New Load, Remaining</w:t>
-      </w:r>
-      <w:proofErr w:type="gramStart"/>
-      <w:r>
-        <w:t>):*</w:t>
-      </w:r>
-      <w:proofErr w:type="gramEnd"/>
-      <w:r>
-        <w:t>* Amps (A), Watts (W)</w:t>
+        <w:t>**All columns (Capacity, Existing Load, Load, Net Change, New Load, Remaining):** Amps (A), Watts (W)</w:t>
       </w:r>
     </w:p>
     <w:p>
@@ -7128,15 +6770,7 @@
         <w:pStyle w:val="PlainText"/>
       </w:pPr>
       <w:r>
-        <w:t xml:space="preserve">**DC scalar-sum </w:t>
-      </w:r>
-      <w:proofErr w:type="gramStart"/>
-      <w:r>
-        <w:t>aggregation:*</w:t>
-      </w:r>
-      <w:proofErr w:type="gramEnd"/>
-      <w:r>
-        <w:t>* add amps; W = V × A.</w:t>
+        <w:t>**DC scalar-sum aggregation:** add amps; W = V × A.</w:t>
       </w:r>
     </w:p>
     <w:p>
@@ -7195,39 +6829,15 @@
         <w:pStyle w:val="PlainText"/>
       </w:pPr>
       <w:r>
-        <w:t>- Node label format: Description `[</w:t>
-      </w:r>
-      <w:proofErr w:type="spellStart"/>
-      <w:r>
-        <w:t>RefDes</w:t>
-      </w:r>
-      <w:proofErr w:type="spellEnd"/>
-      <w:r>
-        <w:t xml:space="preserve">]` — </w:t>
-      </w:r>
-      <w:proofErr w:type="spellStart"/>
-      <w:r>
-        <w:t>RefDes</w:t>
-      </w:r>
-      <w:proofErr w:type="spellEnd"/>
-      <w:r>
-        <w:t xml:space="preserve"> in square brackets appended to description,</w:t>
-      </w:r>
-    </w:p>
-    <w:p>
-      <w:pPr>
-        <w:pStyle w:val="PlainText"/>
-      </w:pPr>
-      <w:r>
-        <w:t xml:space="preserve">  rendered in subdued (secondary) text; </w:t>
-      </w:r>
-      <w:proofErr w:type="spellStart"/>
-      <w:r>
-        <w:t>RefDes</w:t>
-      </w:r>
-      <w:proofErr w:type="spellEnd"/>
-      <w:r>
-        <w:t xml:space="preserve"> omitted if blank</w:t>
+        <w:t>- Node label format: Description `[RefDes]` — RefDes in square brackets appended to description,</w:t>
+      </w:r>
+    </w:p>
+    <w:p>
+      <w:pPr>
+        <w:pStyle w:val="PlainText"/>
+      </w:pPr>
+      <w:r>
+        <w:t xml:space="preserve">  rendered in subdued (secondary) text; RefDes omitted if blank</w:t>
       </w:r>
     </w:p>
     <w:p>
@@ -7267,6 +6877,7 @@
         <w:pStyle w:val="PlainText"/>
       </w:pPr>
       <w:r>
+        <w:lastRenderedPageBreak/>
         <w:t>- Collapse / expand toggle per node</w:t>
       </w:r>
     </w:p>
@@ -7283,16 +6894,7 @@
         <w:pStyle w:val="PlainText"/>
       </w:pPr>
       <w:r>
-        <w:lastRenderedPageBreak/>
-        <w:t xml:space="preserve">- **Add Child** button on each </w:t>
-      </w:r>
-      <w:proofErr w:type="gramStart"/>
-      <w:r>
-        <w:t>node — *</w:t>
-      </w:r>
-      <w:proofErr w:type="gramEnd"/>
-      <w:r>
-        <w:t>*hidden** for terminal nodes (Load type or Removed status)</w:t>
+        <w:t>- **Add Child** button on each node — **hidden** for terminal nodes (Load type or Removed status)</w:t>
       </w:r>
     </w:p>
     <w:p>
@@ -7343,23 +6945,7 @@
         <w:pStyle w:val="PlainText"/>
       </w:pPr>
       <w:r>
-        <w:t>- Description column: same `Description [</w:t>
-      </w:r>
-      <w:proofErr w:type="spellStart"/>
-      <w:r>
-        <w:t>RefDes</w:t>
-      </w:r>
-      <w:proofErr w:type="spellEnd"/>
-      <w:r>
-        <w:t xml:space="preserve">]` format; no separate </w:t>
-      </w:r>
-      <w:proofErr w:type="spellStart"/>
-      <w:r>
-        <w:t>RefDes</w:t>
-      </w:r>
-      <w:proofErr w:type="spellEnd"/>
-      <w:r>
-        <w:t xml:space="preserve"> column</w:t>
+        <w:t>- Description column: same `Description [RefDes]` format; no separate RefDes column</w:t>
       </w:r>
     </w:p>
     <w:p>
@@ -7685,13 +7271,8 @@
         <w:pStyle w:val="PlainText"/>
       </w:pPr>
       <w:r>
-        <w:t>*(Previously named "Edit Item(s)"; renamed to "Edit Item" in Revision 7</w:t>
-      </w:r>
-      <w:proofErr w:type="gramStart"/>
-      <w:r>
-        <w:t>.)*</w:t>
-      </w:r>
-      <w:proofErr w:type="gramEnd"/>
+        <w:t>*(Previously named "Edit Item(s)"; renamed to "Edit Item" in Revision 7.)*</w:t>
+      </w:r>
     </w:p>
     <w:p>
       <w:pPr>
@@ -7775,15 +7356,7 @@
         <w:pStyle w:val="PlainText"/>
       </w:pPr>
       <w:r>
-        <w:t xml:space="preserve">6. </w:t>
-      </w:r>
-      <w:proofErr w:type="spellStart"/>
-      <w:r>
-        <w:t>RefDes</w:t>
-      </w:r>
-      <w:proofErr w:type="spellEnd"/>
-      <w:r>
-        <w:t xml:space="preserve"> (optional)</w:t>
+        <w:t>6. RefDes (optional)</w:t>
       </w:r>
     </w:p>
     <w:p>
@@ -7860,6 +7433,7 @@
         <w:pStyle w:val="PlainText"/>
       </w:pPr>
       <w:r>
+        <w:lastRenderedPageBreak/>
         <w:t>| No parent (new root); regular node | Editable | Editable |</w:t>
       </w:r>
     </w:p>
@@ -7873,7 +7447,6 @@
         <w:pStyle w:val="PlainText"/>
       </w:pPr>
       <w:r>
-        <w:lastRenderedPageBreak/>
         <w:t>### 7.3 Capacity section (non-load items)</w:t>
       </w:r>
     </w:p>
@@ -8043,31 +7616,15 @@
         <w:pStyle w:val="PlainText"/>
       </w:pPr>
       <w:r>
-        <w:t xml:space="preserve">| **A** | VA, W, VAR | VA = V×A; W = </w:t>
-      </w:r>
-      <w:proofErr w:type="spellStart"/>
-      <w:r>
-        <w:t>VA×pf</w:t>
-      </w:r>
-      <w:proofErr w:type="spellEnd"/>
-      <w:r>
-        <w:t>; VAR = √(VA²−W²) |</w:t>
-      </w:r>
-    </w:p>
-    <w:p>
-      <w:pPr>
-        <w:pStyle w:val="PlainText"/>
-      </w:pPr>
-      <w:r>
-        <w:t xml:space="preserve">| **VA** | A, W, VAR | A = VA/V; W = </w:t>
-      </w:r>
-      <w:proofErr w:type="spellStart"/>
-      <w:r>
-        <w:t>VA×pf</w:t>
-      </w:r>
-      <w:proofErr w:type="spellEnd"/>
-      <w:r>
-        <w:t>; VAR = √(VA²−W²) |</w:t>
+        <w:t>| **A** | VA, W, VAR | VA = V×A; W = VA×pf; VAR = √(VA²−W²) |</w:t>
+      </w:r>
+    </w:p>
+    <w:p>
+      <w:pPr>
+        <w:pStyle w:val="PlainText"/>
+      </w:pPr>
+      <w:r>
+        <w:t>| **VA** | A, W, VAR | A = VA/V; W = VA×pf; VAR = √(VA²−W²) |</w:t>
       </w:r>
     </w:p>
     <w:p>
@@ -8091,15 +7648,7 @@
         <w:pStyle w:val="PlainText"/>
       </w:pPr>
       <w:r>
-        <w:t xml:space="preserve">| **pf** | W, VAR | W = </w:t>
-      </w:r>
-      <w:proofErr w:type="spellStart"/>
-      <w:r>
-        <w:t>VA×pf</w:t>
-      </w:r>
-      <w:proofErr w:type="spellEnd"/>
-      <w:r>
-        <w:t>; VAR = √(VA²−W²) |</w:t>
+        <w:t>| **pf** | W, VAR | W = VA×pf; VAR = √(VA²−W²) |</w:t>
       </w:r>
     </w:p>
     <w:p>
@@ -8173,31 +7722,15 @@
         <w:pStyle w:val="PlainText"/>
       </w:pPr>
       <w:r>
-        <w:t>- **</w:t>
-      </w:r>
-      <w:proofErr w:type="spellStart"/>
-      <w:r>
-        <w:t>convPf</w:t>
-      </w:r>
-      <w:proofErr w:type="spellEnd"/>
-      <w:r>
-        <w:t>** input — visible for TRU and Frequency Converter (default TRU = 0.95, FC = 1.0)</w:t>
-      </w:r>
-    </w:p>
-    <w:p>
-      <w:pPr>
-        <w:pStyle w:val="PlainText"/>
-      </w:pPr>
-      <w:r>
-        <w:t xml:space="preserve">- IN/OUT capacity and load auto-derive via efficiency and </w:t>
-      </w:r>
-      <w:proofErr w:type="spellStart"/>
-      <w:r>
-        <w:t>convPf</w:t>
-      </w:r>
-      <w:proofErr w:type="spellEnd"/>
-      <w:r>
-        <w:t xml:space="preserve"> on input</w:t>
+        <w:t>- **convPf** input — visible for TRU and Frequency Converter (default TRU = 0.95, FC = 1.0)</w:t>
+      </w:r>
+    </w:p>
+    <w:p>
+      <w:pPr>
+        <w:pStyle w:val="PlainText"/>
+      </w:pPr>
+      <w:r>
+        <w:t>- IN/OUT capacity and load auto-derive via efficiency and convPf on input</w:t>
       </w:r>
     </w:p>
     <w:p>
@@ -8226,23 +7759,7 @@
         <w:pStyle w:val="PlainText"/>
       </w:pPr>
       <w:r>
-        <w:t xml:space="preserve">- For Conv IN </w:t>
-      </w:r>
-      <w:proofErr w:type="gramStart"/>
-      <w:r>
-        <w:t>nodes:</w:t>
-      </w:r>
-      <w:proofErr w:type="gramEnd"/>
-      <w:r>
-        <w:t xml:space="preserve"> also copies the </w:t>
-      </w:r>
-      <w:proofErr w:type="gramStart"/>
-      <w:r>
-        <w:t>paired OUT</w:t>
-      </w:r>
-      <w:proofErr w:type="gramEnd"/>
-      <w:r>
-        <w:t xml:space="preserve"> child node (child of the copy)</w:t>
+        <w:t>- For Conv IN nodes: also copies the paired OUT child node (child of the copy)</w:t>
       </w:r>
     </w:p>
     <w:p>
@@ -8306,6 +7823,7 @@
         <w:pStyle w:val="PlainText"/>
       </w:pPr>
       <w:r>
+        <w:lastRenderedPageBreak/>
         <w:t>### 8.1 Field layout</w:t>
       </w:r>
     </w:p>
@@ -8322,7 +7840,6 @@
         <w:pStyle w:val="PlainText"/>
       </w:pPr>
       <w:r>
-        <w:lastRenderedPageBreak/>
         <w:t xml:space="preserve">   - Excludes children/descendants of any selected item</w:t>
       </w:r>
     </w:p>
@@ -8339,15 +7856,7 @@
         <w:pStyle w:val="PlainText"/>
       </w:pPr>
       <w:r>
-        <w:t xml:space="preserve">2. **Item Type** </w:t>
-      </w:r>
-      <w:proofErr w:type="gramStart"/>
-      <w:r>
-        <w:t>dropdown — "</w:t>
-      </w:r>
-      <w:proofErr w:type="gramEnd"/>
-      <w:r>
-        <w:t>Aircraft Total" only when Parent = "No Parent"</w:t>
+        <w:t>2. **Item Type** dropdown — "Aircraft Total" only when Parent = "No Parent"</w:t>
       </w:r>
     </w:p>
     <w:p>
@@ -8391,13 +7900,8 @@
       <w:pPr>
         <w:pStyle w:val="PlainText"/>
       </w:pPr>
-      <w:proofErr w:type="gramStart"/>
-      <w:r>
-        <w:t>- On open</w:t>
-      </w:r>
-      <w:proofErr w:type="gramEnd"/>
-      <w:r>
-        <w:t>: clear existing table rows</w:t>
+      <w:r>
+        <w:t>- On open: clear existing table rows</w:t>
       </w:r>
     </w:p>
     <w:p>
@@ -8426,23 +7930,7 @@
         <w:pStyle w:val="PlainText"/>
       </w:pPr>
       <w:r>
-        <w:t xml:space="preserve">All row types </w:t>
-      </w:r>
-      <w:proofErr w:type="gramStart"/>
-      <w:r>
-        <w:t>include:</w:t>
-      </w:r>
-      <w:proofErr w:type="gramEnd"/>
-      <w:r>
-        <w:t xml:space="preserve"> Description, </w:t>
-      </w:r>
-      <w:proofErr w:type="spellStart"/>
-      <w:r>
-        <w:t>RefDes</w:t>
-      </w:r>
-      <w:proofErr w:type="spellEnd"/>
-      <w:r>
-        <w:t xml:space="preserve"> (optional)</w:t>
+        <w:t>All row types include: Description, RefDes (optional)</w:t>
       </w:r>
     </w:p>
     <w:p>
@@ -8700,31 +8188,15 @@
         <w:pStyle w:val="PlainText"/>
       </w:pPr>
       <w:r>
-        <w:t xml:space="preserve">| Load, status = New | </w:t>
-      </w:r>
-      <w:proofErr w:type="spellStart"/>
-      <w:r>
-        <w:t>loadValue</w:t>
-      </w:r>
-      <w:proofErr w:type="spellEnd"/>
-      <w:r>
-        <w:t xml:space="preserve"> |</w:t>
-      </w:r>
-    </w:p>
-    <w:p>
-      <w:pPr>
-        <w:pStyle w:val="PlainText"/>
-      </w:pPr>
-      <w:r>
-        <w:t>| Load, status = Removed | −</w:t>
-      </w:r>
-      <w:proofErr w:type="spellStart"/>
-      <w:r>
-        <w:t>loadValue</w:t>
-      </w:r>
-      <w:proofErr w:type="spellEnd"/>
-      <w:r>
-        <w:t xml:space="preserve"> |</w:t>
+        <w:t>| Load, status = New | loadValue |</w:t>
+      </w:r>
+    </w:p>
+    <w:p>
+      <w:pPr>
+        <w:pStyle w:val="PlainText"/>
+      </w:pPr>
+      <w:r>
+        <w:t>| Load, status = Removed | −loadValue |</w:t>
       </w:r>
     </w:p>
     <w:p>
@@ -8740,31 +8212,16 @@
         <w:pStyle w:val="PlainText"/>
       </w:pPr>
       <w:r>
-        <w:t>| Non-load, status = Removed | −</w:t>
-      </w:r>
-      <w:proofErr w:type="spellStart"/>
-      <w:r>
-        <w:t>existingLoad</w:t>
-      </w:r>
-      <w:proofErr w:type="spellEnd"/>
-      <w:r>
-        <w:t xml:space="preserve"> |</w:t>
-      </w:r>
-    </w:p>
-    <w:p>
-      <w:pPr>
-        <w:pStyle w:val="PlainText"/>
-      </w:pPr>
-      <w:r>
-        <w:t xml:space="preserve">| Non-load with </w:t>
-      </w:r>
-      <w:proofErr w:type="spellStart"/>
-      <w:r>
-        <w:t>netChangeOverride</w:t>
-      </w:r>
-      <w:proofErr w:type="spellEnd"/>
-      <w:r>
-        <w:t xml:space="preserve"> | override value |</w:t>
+        <w:t>| Non-load, status = Removed | −existingLoad |</w:t>
+      </w:r>
+    </w:p>
+    <w:p>
+      <w:pPr>
+        <w:pStyle w:val="PlainText"/>
+      </w:pPr>
+      <w:r>
+        <w:lastRenderedPageBreak/>
+        <w:t>| Non-load with netChangeOverride | override value |</w:t>
       </w:r>
     </w:p>
     <w:p>
@@ -8780,16 +8237,7 @@
         <w:pStyle w:val="PlainText"/>
       </w:pPr>
       <w:r>
-        <w:lastRenderedPageBreak/>
-        <w:t xml:space="preserve">| Conv IN node | derived from conv OUT NC via efficiency and </w:t>
-      </w:r>
-      <w:proofErr w:type="spellStart"/>
-      <w:r>
-        <w:t>convPf</w:t>
-      </w:r>
-      <w:proofErr w:type="spellEnd"/>
-      <w:r>
-        <w:t xml:space="preserve"> |</w:t>
+        <w:t>| Conv IN node | derived from conv OUT NC via efficiency and convPf |</w:t>
       </w:r>
     </w:p>
     <w:p>
@@ -8810,34 +8258,16 @@
         <w:pStyle w:val="PlainText"/>
       </w:pPr>
       <w:r>
-        <w:t xml:space="preserve">- **New Load** = </w:t>
-      </w:r>
-      <w:proofErr w:type="spellStart"/>
-      <w:r>
-        <w:t>existingLoad</w:t>
-      </w:r>
-      <w:proofErr w:type="spellEnd"/>
-      <w:r>
-        <w:t xml:space="preserve"> + </w:t>
-      </w:r>
-      <w:proofErr w:type="spellStart"/>
-      <w:r>
-        <w:t>netChange</w:t>
-      </w:r>
-      <w:proofErr w:type="spellEnd"/>
-    </w:p>
-    <w:p>
-      <w:pPr>
-        <w:pStyle w:val="PlainText"/>
-      </w:pPr>
-      <w:r>
-        <w:t xml:space="preserve">- **Remaining Capacity** = capacity − </w:t>
-      </w:r>
-      <w:proofErr w:type="spellStart"/>
-      <w:r>
-        <w:t>newLoad</w:t>
-      </w:r>
-      <w:proofErr w:type="spellEnd"/>
+        <w:t>- **New Load** = existingLoad + netChange</w:t>
+      </w:r>
+    </w:p>
+    <w:p>
+      <w:pPr>
+        <w:pStyle w:val="PlainText"/>
+      </w:pPr>
+      <w:r>
+        <w:t>- **Remaining Capacity** = capacity − newLoad</w:t>
+      </w:r>
     </w:p>
     <w:p>
       <w:pPr>
@@ -8978,36 +8408,7 @@
         <w:pStyle w:val="PlainText"/>
       </w:pPr>
       <w:r>
-        <w:t>- **Export JSON**: metadata + full node tree → file named `</w:t>
-      </w:r>
-      <w:proofErr w:type="spellStart"/>
-      <w:r>
-        <w:t>WattsUp</w:t>
-      </w:r>
-      <w:proofErr w:type="spellEnd"/>
-      <w:r>
-        <w:t>_{</w:t>
-      </w:r>
-      <w:proofErr w:type="gramStart"/>
-      <w:r>
-        <w:t>make}_{model}_{serial}_{</w:t>
-      </w:r>
-      <w:proofErr w:type="gramEnd"/>
-      <w:r>
-        <w:t>date</w:t>
-      </w:r>
-      <w:proofErr w:type="gramStart"/>
-      <w:r>
-        <w:t>}.</w:t>
-      </w:r>
-      <w:proofErr w:type="spellStart"/>
-      <w:r>
-        <w:t>json</w:t>
-      </w:r>
-      <w:proofErr w:type="spellEnd"/>
-      <w:proofErr w:type="gramEnd"/>
-      <w:r>
-        <w:t>`</w:t>
+        <w:t>- **Export JSON**: metadata + full node tree → file named `WattsUp_{make}_{model}_{serial}_{date}.json`</w:t>
       </w:r>
     </w:p>
     <w:p>
@@ -9023,15 +8424,7 @@
         <w:pStyle w:val="PlainText"/>
       </w:pPr>
       <w:r>
-        <w:t xml:space="preserve">- **Auto-save to </w:t>
-      </w:r>
-      <w:proofErr w:type="spellStart"/>
-      <w:r>
-        <w:t>localStorage</w:t>
-      </w:r>
-      <w:proofErr w:type="spellEnd"/>
-      <w:r>
-        <w:t>**: state persisted across page refreshes</w:t>
+        <w:t>- **Auto-save to localStorage**: state persisted across page refreshes</w:t>
       </w:r>
     </w:p>
     <w:p>

</xml_diff>